<commit_message>
Envío: referencias desde el borrador y comillas anidadas
La lista de referencias se toma del borrador, que ya adoptó la revisión.
El conversor baja a ‘ ’ las “ ” anidadas dentro de « » y reconoce enteras
las notas [FALTA …] que llevan corchetes adentro.

Co-Authored-By: Claude Opus 5.5 <noreply@anthropic.com>
Claude-Session: https://claude.ai/code/session_01EqReKmTNdLhWKGUMw7cNL7
</commit_message>
<xml_diff>
--- a/proyectos/Bouvard & Pécuchet/envio/docx/Lo posible y lo_Cuevas Ventura.docx
+++ b/proyectos/Bouvard & Pécuchet/envio/docx/Lo posible y lo_Cuevas Ventura.docx
@@ -647,7 +647,7 @@
         <w:rPr>
           <w:sz w:val="20"/>
         </w:rPr>
-        <w:t xml:space="preserve">El ejemplar que se usa aquí es el de la Biblioteca de la Universidad de Sevilla, digitalizado en Internet Archive con el atlas de láminas. El catálogo le pone “[1834?]”, el año de la primera edición, pero el libro se presenta como “seconde édition” y lleva encuadernados catálogos de Roret de junio de 1859 (Boitard s. f., vi y hojas finales). Flaubert leyó el manual en la década de 1870, mientras preparaba la novela. Las reglas que cita este artículo ya estaban en el primer libro de jardines de Boitard, de 1825 (Boitard 1825, 5–6), así que cualquier edición a su alcance las traía. </w:t>
+        <w:t xml:space="preserve">El ejemplar que se usa aquí es el de la Biblioteca de la Universidad de Sevilla, digitalizado en Internet Archive con el atlas de láminas. El catálogo le pone “[1834?]”, el año de la primera edición, pero la portada dice “nouvelle édition”, una nota habla de “cette seconde édition” y el ejemplar lleva encuadernados catálogos de Roret de junio de 1859 (Boitard s. f., portada, vi y hojas finales). Flaubert leyó el manual en la década de 1870, mientras preparaba la novela. Las reglas que cita este artículo ya estaban en el primer libro de jardines de Boitard, de 1825 (Boitard 1825, 5–6), así que cualquier edición a su alcance las traía. </w:t>
       </w:r>
       <w:r>
         <w:rPr>
@@ -1803,18 +1803,32 @@
           <w:color w:val="808080"/>
           <w:sz w:val="20"/>
         </w:rPr>
-        <w:t>[FALTA: sumar lo que escriban los modelos con el protocolo limpio (apartado 5), como columna o como tabla aparte; los pilotos no entran. En la maqueta, la cursiva puede pasar a gris, como en la hoja de trabajo (`laminas/cotejo.html`).]</w:t>
-      </w:r>
-    </w:p>
-    <w:p>
-      <w:pPr>
-        <w:jc w:val="both"/>
-      </w:pPr>
-      <w:r>
-        <w:rPr>
-          <w:sz w:val="20"/>
-        </w:rPr>
-        <w:t>Entre el manual y la novela hay dos copias más: la nota de lectura de Flaubert y los borradores. La nota es una lista. Empieza “Boitard "architecte des jardins" on a inventé des genres” y sigue con los géneros, las escenas y las plantas (Carnet 18 bis, f. 8, en Dord-Crouslé 2003). Guarda una distancia, la del “on”, porque Boitard atribuye los géneros a otros autores (Boitard s. f., 21). Pero no copia ninguna conveniencia ni ninguna condición. En los borradores el “on” se vuelve “L'auteur les divise par genres, ou scènes” (Ms g 225-2, f. 169), y los géneros pasan a ser de Boitard. La regla, entonces, no se pierde al redactar. Ya falta al leer.</w:t>
+        <w:t>[FALTA: sumar lo que escriban los modelos con el protocolo limpio (apartado 5), como columna o como tabla aparte; los pilotos no entran. En la maqueta, la cursiva puede pasar a gris, como en la hoja de trabajo (</w:t>
+      </w:r>
+      <w:r>
+        <w:rPr>
+          <w:color w:val="808080"/>
+          <w:sz w:val="20"/>
+        </w:rPr>
+        <w:t>laminas/cotejo.html</w:t>
+      </w:r>
+      <w:r>
+        <w:rPr>
+          <w:color w:val="808080"/>
+          <w:sz w:val="20"/>
+        </w:rPr>
+        <w:t>).]</w:t>
+      </w:r>
+    </w:p>
+    <w:p>
+      <w:pPr>
+        <w:jc w:val="both"/>
+      </w:pPr>
+      <w:r>
+        <w:rPr>
+          <w:sz w:val="20"/>
+        </w:rPr>
+        <w:t>Entre el manual y la novela hay dos copias más: la nota de lectura de Flaubert y los borradores, que se citan por manuscrito y folio. La nota es una lista. Empieza “Boitard ‘architecte des jardins’ on a inventé des genres” y sigue con los géneros, las escenas y las plantas (Carnet 18 bis, f. 8, en Dord-Crouslé 2003). Guarda una distancia, la del “on”, porque Boitard atribuye los géneros a otros autores (Boitard s. f., 21). Pero no copia ninguna conveniencia ni ninguna condición. En los borradores el “on” se vuelve “L'auteur les divise par genres, ou scènes” (Ms g 225-2, f. 169), y los géneros pasan a ser de Boitard. La regla, entonces, no se pierde al redactar. Ya falta al leer.</w:t>
       </w:r>
     </w:p>
     <w:p>
@@ -2699,7 +2713,22 @@
           <w:color w:val="808080"/>
           <w:sz w:val="20"/>
         </w:rPr>
-        <w:t>[FALTA: ver las cartas en la *Correspondance*, t. IV, pp. 813 y 816, y el folio en el manuscrito.]</w:t>
+        <w:t xml:space="preserve">[FALTA: ver las cartas en la </w:t>
+      </w:r>
+      <w:r>
+        <w:rPr>
+          <w:i/>
+          <w:color w:val="808080"/>
+          <w:sz w:val="20"/>
+        </w:rPr>
+        <w:t>Correspondance</w:t>
+      </w:r>
+      <w:r>
+        <w:rPr>
+          <w:color w:val="808080"/>
+          <w:sz w:val="20"/>
+        </w:rPr>
+        <w:t>, t. IV, pp. 813 y 816, y el folio en el manuscrito.]</w:t>
       </w:r>
       <w:r>
         <w:rPr>
@@ -3164,7 +3193,7 @@
         <w:rPr>
           <w:sz w:val="20"/>
         </w:rPr>
-        <w:t>Los modelos de lenguaje se describieron como sistemas que juntan secuencias de formas vistas en sus datos, según la probabilidad con que se combinan, sin referencia al significado (Bender et al. 2021, 616–617). La comparación con los dos copistas está a la mano, y por eso conviene desconfiar de ella. El artículo no afirma que una máquina “piense” como Bouvard y Pécuchet. Compara procedimientos: tomar un repertorio y usarlo sin las reglas de su uso. Y lo pone a prueba con consignas escritas antes de generar.</w:t>
+        <w:t>Los modelos de lenguaje se describieron como sistemas que juntan secuencias de formas vistas en sus datos, según la probabilidad con que se combinan, sin referencia al significado (Bender et al. 2021, 616–17). La comparación con los dos copistas está a la mano, y por eso conviene desconfiar de ella. El artículo no afirma que una máquina “piense” como Bouvard y Pécuchet. Compara procedimientos: tomar un repertorio y usarlo sin las reglas de su uso. Y lo pone a prueba con consignas escritas antes de generar.</w:t>
       </w:r>
     </w:p>
     <w:p>
@@ -3205,7 +3234,22 @@
           <w:color w:val="808080"/>
           <w:sz w:val="20"/>
         </w:rPr>
-        <w:t>[POSIBLE: la palabra que une las dos puntas de la cadena es *verosímil*. Para Blondel, la conveniencia impedía introducir “rien qui ne soit vraissemblable” (1754, 161): lo verosímil se medía con la conveniencia. En un modelo de lenguaje, lo verosímil es la medida misma, y la conveniencia entra solo si alguien la escribe en la consigna (§5.3). FALTA una cita técnica sobre cómo un modelo elige la continuación probable, además de Bender et al. (2021).]</w:t>
+        <w:t xml:space="preserve">[POSIBLE: la palabra que une las dos puntas de la cadena es </w:t>
+      </w:r>
+      <w:r>
+        <w:rPr>
+          <w:i/>
+          <w:color w:val="808080"/>
+          <w:sz w:val="20"/>
+        </w:rPr>
+        <w:t>verosímil</w:t>
+      </w:r>
+      <w:r>
+        <w:rPr>
+          <w:color w:val="808080"/>
+          <w:sz w:val="20"/>
+        </w:rPr>
+        <w:t>. Para Blondel, la conveniencia impedía introducir “rien qui ne soit vraissemblable” (1754, 161): lo verosímil se medía con la conveniencia. En un modelo de lenguaje, lo verosímil es la medida misma, y la conveniencia entra solo si alguien la escribe en la consigna (§5.3). FALTA una cita técnica sobre cómo un modelo elige la continuación probable, además de Bender et al. (2021).]</w:t>
       </w:r>
     </w:p>
     <w:p>
@@ -3327,7 +3371,7 @@
           <w:color w:val="808080"/>
           <w:sz w:val="20"/>
         </w:rPr>
-        <w:t>[Si el protocolo limpio confirma los pilotos, el apartado cuenta otra historia que la prevista. La máquina no copia a los copistas. Sin el libro repite la tradición; con el libro habla como el cura. Pero el cura vio el jardín desde el comedor y lo recorrió, y el modelo habla de una lista que no vio. Cárcamo pregunta si no confundimos “hablar acerca de un edificio, con ver un edificio, o con hacer un edificio” (Salazar y Cárcamo Pino 2021, 1485). Lo que la salida reproduce es la forma del juicio, no la mirada. Maturana decía algo parecido de los primeros laboratorios de inteligencia artificial: imitaban “la apariencia” de los fenómenos “en el ámbito de su visión como observadores” (Maturana 2004, 13). Lo que se pierde en la cadena no es la regla sino la fuente, y lo que ninguna copia trae es el sitio.]</w:t>
+        <w:t>[Si el protocolo limpio confirma los pilotos, el apartado cuenta otra historia que la prevista. La máquina no copia a los copistas. Sin el libro repite la tradición; con el libro habla como el cura. Pero el cura vio el jardín desde el comedor y lo recorrió, y el modelo habla de una lista que no vio. Cárcamo pregunta si no confundimos “hablar acerca de un edificio, con ver un edificio, o con hacer un edificio” (Salazar-Sánchez y Cárcamo-Pino 2021, 1485). Lo que la salida reproduce es la forma del juicio, no la mirada. Maturana decía algo parecido de los primeros laboratorios de inteligencia artificial: imitaban “la apariencia” de los fenómenos “en el ámbito de su visión como observadores” (Maturana 2004, 13). Lo que se pierde en la cadena no es la regla sino la fuente, y lo que ninguna copia trae es el sitio.]</w:t>
       </w:r>
     </w:p>
     <w:p>
@@ -3591,7 +3635,22 @@
           <w:color w:val="808080"/>
           <w:sz w:val="20"/>
         </w:rPr>
-        <w:t>[POSIBLE, cotejar en la *Correspondance*: cuando Flaubert pidió que el hijo de George Sand le contara sus errores de agricultor, la respuesta fue que “chaque faute est spéciale au milieu où l'on opère” (Sand a Flaubert, 5 de febrero de 1873, citada en Leclerc 2019). No le sirvió: buscaba fracasos para contar, y Maurice le contestó con una regla de sitio.]</w:t>
+        <w:t xml:space="preserve">[POSIBLE, cotejar en la </w:t>
+      </w:r>
+      <w:r>
+        <w:rPr>
+          <w:i/>
+          <w:color w:val="808080"/>
+          <w:sz w:val="20"/>
+        </w:rPr>
+        <w:t>Correspondance</w:t>
+      </w:r>
+      <w:r>
+        <w:rPr>
+          <w:color w:val="808080"/>
+          <w:sz w:val="20"/>
+        </w:rPr>
+        <w:t>: cuando Flaubert pidió que el hijo de George Sand le contara sus errores de agricultor, la respuesta fue que “chaque faute est spéciale au milieu où l'on opère” (Sand a Flaubert, 5 de febrero de 1873, citada en Leclerc 2019). No le sirvió: buscaba fracasos para contar, y Maurice le contestó con una regla de sitio.]</w:t>
       </w:r>
     </w:p>
     <w:p>
@@ -3857,7 +3916,7 @@
         <w:rPr>
           <w:sz w:val="16"/>
         </w:rPr>
-        <w:t xml:space="preserve">Bender, Emily M., Timnit Gebru, Angelina McMillan-Major y Shmargaret Shmitchell. 2021. “On the Dangers of Stochastic Parrots: Can Language Models Be Too Big?” En </w:t>
+        <w:t xml:space="preserve">Bender, Emily M., Timnit Gebru, Angelina McMillan-Major y Shmargaret Shmitchell. 2021. “On the Dangers of Stochastic Parrots: Can Language Models Be Too Big?”. En </w:t>
       </w:r>
       <w:r>
         <w:rPr>
@@ -3881,18 +3940,18 @@
         <w:rPr>
           <w:sz w:val="16"/>
         </w:rPr>
-        <w:t>Blondel, Jacques-François. 1752. “Bienseance (terme d’Architecture)”. En Diderot y d’Alembert 1751–65, 2:245.</w:t>
-      </w:r>
-    </w:p>
-    <w:p>
-      <w:pPr>
-        <w:jc w:val="both"/>
-      </w:pPr>
-      <w:r>
-        <w:rPr>
-          <w:sz w:val="16"/>
-        </w:rPr>
-        <w:t>Blondel, Jacques-François. 1754. “Convenance (terme d’Architecture)”. En Diderot y d’Alembert 1751–65, 4:161.</w:t>
+        <w:t>Blondel, Jacques-François. 1752. “Bienseance (terme d'Architecture)”. En Diderot y d'Alembert 1751–65, 2:245.</w:t>
+      </w:r>
+    </w:p>
+    <w:p>
+      <w:pPr>
+        <w:jc w:val="both"/>
+      </w:pPr>
+      <w:r>
+        <w:rPr>
+          <w:sz w:val="16"/>
+        </w:rPr>
+        <w:t>Blondel, Jacques-François. 1754. “Convenance (terme d'Architecture)”. En Diderot y d'Alembert 1751–65, 4:161.</w:t>
       </w:r>
     </w:p>
     <w:p>
@@ -3910,7 +3969,7 @@
           <w:i/>
           <w:sz w:val="16"/>
         </w:rPr>
-        <w:t>Traité de la composition et de l’ornement des jardins</w:t>
+        <w:t>Traité de la composition et de l'ornement des jardins</w:t>
       </w:r>
       <w:r>
         <w:rPr>
@@ -3934,13 +3993,13 @@
           <w:i/>
           <w:sz w:val="16"/>
         </w:rPr>
-        <w:t>Nouveau manuel complet de l’architecte des jardins, ou l’art de les composer et de les décorer</w:t>
-      </w:r>
-      <w:r>
-        <w:rPr>
-          <w:sz w:val="16"/>
-        </w:rPr>
-        <w:t>. 2.ª ed. 2 vols. (texto y atlas). París: Roret. Ejemplar de la Biblioteca de la Universidad de Sevilla, A 039(a)/018–019. https://archive.org/details/A039a018 y https://archive.org/details/A039a019.</w:t>
+        <w:t>Nouveau manuel complet de l'architecte des jardins, ou l'art de les composer et de les décorer</w:t>
+      </w:r>
+      <w:r>
+        <w:rPr>
+          <w:sz w:val="16"/>
+        </w:rPr>
+        <w:t>. Nueva ed. 2 vols. (texto y atlas). París: Roret. Ejemplar de la Biblioteca de la Universidad de Sevilla, A 039(a)/018–019. https://archive.org/details/A039a018 y https://archive.org/details/A039a019.</w:t>
       </w:r>
     </w:p>
     <w:p>
@@ -3988,18 +4047,25 @@
         <w:rPr>
           <w:sz w:val="16"/>
         </w:rPr>
-        <w:t>, n.º 3. https://doi.org/10.11588/dah.2018.3.49913.</w:t>
-      </w:r>
-    </w:p>
-    <w:p>
-      <w:pPr>
-        <w:jc w:val="both"/>
-      </w:pPr>
-      <w:r>
-        <w:rPr>
-          <w:sz w:val="16"/>
-        </w:rPr>
-        <w:t xml:space="preserve">Carrico, Abbey. 2019. “L’eau et l’agriculture dans </w:t>
+        <w:t xml:space="preserve">, n.º 3. https://doi.org/10.11588/dah.2018.3.49913. </w:t>
+      </w:r>
+      <w:r>
+        <w:rPr>
+          <w:color w:val="808080"/>
+          <w:sz w:val="16"/>
+        </w:rPr>
+        <w:t>[FALTA: leer el artículo completo, o citar solo lo que dice el resumen.]</w:t>
+      </w:r>
+    </w:p>
+    <w:p>
+      <w:pPr>
+        <w:jc w:val="both"/>
+      </w:pPr>
+      <w:r>
+        <w:rPr>
+          <w:sz w:val="16"/>
+        </w:rPr>
+        <w:t xml:space="preserve">Carrico, Abbey. 2019. “L'eau et l'agriculture dans </w:t>
       </w:r>
       <w:r>
         <w:rPr>
@@ -4036,29 +4102,29 @@
         <w:rPr>
           <w:sz w:val="16"/>
         </w:rPr>
-        <w:t>Diderot, Denis. 1754a. “Convenance (Gramm. &amp; Morale)”. En Diderot y d’Alembert 1751–65, 4:160–61.</w:t>
-      </w:r>
-    </w:p>
-    <w:p>
-      <w:pPr>
-        <w:jc w:val="both"/>
-      </w:pPr>
-      <w:r>
-        <w:rPr>
-          <w:sz w:val="16"/>
-        </w:rPr>
-        <w:t>Diderot, Denis. 1754b. “Copiste (Art méch.)”. En Diderot y d’Alembert 1751–65, 4:177.</w:t>
-      </w:r>
-    </w:p>
-    <w:p>
-      <w:pPr>
-        <w:jc w:val="both"/>
-      </w:pPr>
-      <w:r>
-        <w:rPr>
-          <w:sz w:val="16"/>
-        </w:rPr>
-        <w:t xml:space="preserve">Diderot, Denis, y Jean le Rond d’Alembert, eds. 1751–65. </w:t>
+        <w:t>Diderot, Denis. 1754a. “Convenance (Gramm. &amp; Morale)”. En Diderot y d'Alembert 1751–65, 4:160–61.</w:t>
+      </w:r>
+    </w:p>
+    <w:p>
+      <w:pPr>
+        <w:jc w:val="both"/>
+      </w:pPr>
+      <w:r>
+        <w:rPr>
+          <w:sz w:val="16"/>
+        </w:rPr>
+        <w:t>Diderot, Denis. 1754b. “Copiste (Art méch.)”. En Diderot y d'Alembert 1751–65, 4:177.</w:t>
+      </w:r>
+    </w:p>
+    <w:p>
+      <w:pPr>
+        <w:jc w:val="both"/>
+      </w:pPr>
+      <w:r>
+        <w:rPr>
+          <w:sz w:val="16"/>
+        </w:rPr>
+        <w:t xml:space="preserve">Diderot, Denis, y Jean le Rond d'Alembert, eds. 1751–65. </w:t>
       </w:r>
       <w:r>
         <w:rPr>
@@ -4082,7 +4148,7 @@
         <w:rPr>
           <w:sz w:val="16"/>
         </w:rPr>
-        <w:t xml:space="preserve">Dord-Crouslé, Stéphanie. 2003. “Flaubert et les manuels Roret ou le paradoxe de la vulgarisation: L’art des jardins dans </w:t>
+        <w:t xml:space="preserve">Dord-Crouslé, Stéphanie. 2003. “Flaubert et les manuels Roret ou le paradoxe de la vulgarisation: L'art des jardins dans </w:t>
       </w:r>
       <w:r>
         <w:rPr>
@@ -4126,7 +4192,7 @@
           <w:i/>
           <w:sz w:val="16"/>
         </w:rPr>
-        <w:t>Les mythologies du jardin de l’Antiquité à la fin du XIXe siècle</w:t>
+        <w:t>Les mythologies du jardin de l'Antiquité à la fin du XIXe siècle</w:t>
       </w:r>
       <w:r>
         <w:rPr>
@@ -4143,6 +4209,68 @@
         <w:rPr>
           <w:sz w:val="16"/>
         </w:rPr>
+        <w:t xml:space="preserve">Flaubert, Gustave. 1910. </w:t>
+      </w:r>
+      <w:r>
+        <w:rPr>
+          <w:i/>
+          <w:sz w:val="16"/>
+        </w:rPr>
+        <w:t>Bouvard et Pécuchet</w:t>
+      </w:r>
+      <w:r>
+        <w:rPr>
+          <w:sz w:val="16"/>
+        </w:rPr>
+        <w:t xml:space="preserve">. Œuvres complètes de Gustave Flaubert. París: Louis Conard. </w:t>
+      </w:r>
+      <w:r>
+        <w:rPr>
+          <w:color w:val="808080"/>
+          <w:sz w:val="16"/>
+        </w:rPr>
+        <w:t>[FALTA: Wikisource lo da como “tome I”; comprobar en el facsímil si el volumen lleva número. Pasar a una edición crítica.]</w:t>
+      </w:r>
+    </w:p>
+    <w:p>
+      <w:pPr>
+        <w:jc w:val="both"/>
+      </w:pPr>
+      <w:r>
+        <w:rPr>
+          <w:sz w:val="16"/>
+        </w:rPr>
+        <w:t xml:space="preserve">Flaubert, Gustave. 1998. </w:t>
+      </w:r>
+      <w:r>
+        <w:rPr>
+          <w:i/>
+          <w:sz w:val="16"/>
+        </w:rPr>
+        <w:t>Correspondance</w:t>
+      </w:r>
+      <w:r>
+        <w:rPr>
+          <w:sz w:val="16"/>
+        </w:rPr>
+        <w:t xml:space="preserve">. Vol. 4. Editado por Jean Bruneau. Bibliothèque de la Pléiade. París: Gallimard. Citado en Carrico 2019. </w:t>
+      </w:r>
+      <w:r>
+        <w:rPr>
+          <w:color w:val="808080"/>
+          <w:sz w:val="16"/>
+        </w:rPr>
+        <w:t>[FALTA: ver las pp. 813 y 816.]</w:t>
+      </w:r>
+    </w:p>
+    <w:p>
+      <w:pPr>
+        <w:jc w:val="both"/>
+      </w:pPr>
+      <w:r>
+        <w:rPr>
+          <w:sz w:val="16"/>
+        </w:rPr>
         <w:t xml:space="preserve">Flaubert, Gustave. s. f. Borradores de </w:t>
       </w:r>
       <w:r>
@@ -4180,7 +4308,18 @@
         <w:rPr>
           <w:sz w:val="16"/>
         </w:rPr>
-        <w:t xml:space="preserve">Flaubert, Gustave. 1910. </w:t>
+        <w:t>Flaubert, Gustave. s. f. Carnet de travail 18 bis. Bibliothèque historique de la Ville de Paris. Citado en Dord-Crouslé 2003.</w:t>
+      </w:r>
+    </w:p>
+    <w:p>
+      <w:pPr>
+        <w:jc w:val="both"/>
+      </w:pPr>
+      <w:r>
+        <w:rPr>
+          <w:sz w:val="16"/>
+        </w:rPr>
+        <w:t xml:space="preserve">Flaubert, Gustave. s. f. Plan de </w:t>
       </w:r>
       <w:r>
         <w:rPr>
@@ -4193,20 +4332,14 @@
         <w:rPr>
           <w:sz w:val="16"/>
         </w:rPr>
-        <w:t xml:space="preserve">. Vol. 1 de </w:t>
-      </w:r>
-      <w:r>
-        <w:rPr>
-          <w:i/>
-          <w:sz w:val="16"/>
-        </w:rPr>
-        <w:t>Œuvres complètes de Gustave Flaubert</w:t>
-      </w:r>
-      <w:r>
-        <w:rPr>
-          <w:sz w:val="16"/>
-        </w:rPr>
-        <w:t>. París: Louis Conard. https://gallica.bnf.fr/ark:/12148/bpt6k208211x.</w:t>
+        <w:t xml:space="preserve">. Ms gg 10. Bibliothèque municipale de Rouen. Citado en Carrico 2019. </w:t>
+      </w:r>
+      <w:r>
+        <w:rPr>
+          <w:color w:val="808080"/>
+          <w:sz w:val="16"/>
+        </w:rPr>
+        <w:t>[FALTA: ver el f. 33.]</w:t>
       </w:r>
     </w:p>
     <w:p>
@@ -4237,7 +4370,7 @@
           <w:color w:val="808080"/>
           <w:sz w:val="16"/>
         </w:rPr>
-        <w:t>[FALTA: URL.]</w:t>
+        <w:t>[FALTA: URL; el sitio de la revista no respondió el 26 de octubre.]</w:t>
       </w:r>
     </w:p>
     <w:p>
@@ -4307,7 +4440,7 @@
         <w:rPr>
           <w:sz w:val="16"/>
         </w:rPr>
-        <w:t>. 6.ª ed. Santiago de Chile: Editorial Universitaria.</w:t>
+        <w:t>. 6.ª ed. Santiago de Chile: Editorial Universitaria; Buenos Aires: Lumen.</w:t>
       </w:r>
     </w:p>
     <w:p>

</xml_diff>